<commit_message>
Update CA loan templates and frontend
</commit_message>
<xml_diff>
--- a/ca_note_template.docx
+++ b/ca_note_template.docx
@@ -1005,14 +1005,12 @@
         </w:rPr>
         <w:t xml:space="preserve">6 months of </w:t>
       </w:r>
-      <w:proofErr w:type="spellStart"/>
-      <w:r>
-        <w:rPr>
-          <w:b/>
-        </w:rPr>
-        <w:t>Guranteed</w:t>
-      </w:r>
-      <w:proofErr w:type="spellEnd"/>
+      <w:r>
+        <w:rPr>
+          <w:b/>
+        </w:rPr>
+        <w:t>Guaranteed</w:t>
+      </w:r>
       <w:r>
         <w:rPr>
           <w:b/>
@@ -1279,32 +1277,6 @@
                 <w:szCs w:val="18"/>
               </w:rPr>
               <w:t>{{SIGNATURE_TITLE}}</w:t>
-            </w:r>
-          </w:p>
-          <w:p>
-            <w:pPr>
-              <w:pStyle w:val="BodyText"/>
-              <w:tabs>
-                <w:tab w:val="left" w:pos="5118"/>
-              </w:tabs>
-              <w:spacing w:before="12"/>
-              <w:rPr>
-                <w:rFonts w:ascii="Times New Roman" w:hAnsi="Times New Roman" w:cs="Times New Roman"/>
-                <w:noProof/>
-                <w:color w:val="211E1F"/>
-                <w:sz w:val="18"/>
-                <w:szCs w:val="18"/>
-              </w:rPr>
-            </w:pPr>
-            <w:r>
-              <w:rPr>
-                <w:rFonts w:ascii="Times New Roman" w:hAnsi="Times New Roman" w:cs="Times New Roman"/>
-                <w:noProof/>
-                <w:color w:val="211E1F"/>
-                <w:sz w:val="18"/>
-                <w:szCs w:val="18"/>
-              </w:rPr>
-              <w:t>{{VESTING}}</w:t>
             </w:r>
           </w:p>
           <w:p>
@@ -1414,25 +1386,7 @@
                 <w:sz w:val="18"/>
                 <w:szCs w:val="18"/>
               </w:rPr>
-              <w:t>{{SIGNATURE_FOOTER</w:t>
-            </w:r>
-            <w:r>
-              <w:rPr>
-                <w:rFonts w:ascii="Times New Roman" w:hAnsi="Times New Roman" w:cs="Times New Roman"/>
-                <w:color w:val="211E1F"/>
-                <w:sz w:val="18"/>
-                <w:szCs w:val="18"/>
-              </w:rPr>
-              <w:t>_2</w:t>
-            </w:r>
-            <w:r>
-              <w:rPr>
-                <w:rFonts w:ascii="Times New Roman" w:hAnsi="Times New Roman" w:cs="Times New Roman"/>
-                <w:color w:val="211E1F"/>
-                <w:sz w:val="18"/>
-                <w:szCs w:val="18"/>
-              </w:rPr>
-              <w:t>}}</w:t>
+              <w:t>{{SIGNATURE_FOOTER_2}}</w:t>
             </w:r>
           </w:p>
           <w:p>
@@ -1456,51 +1410,7 @@
                 <w:sz w:val="18"/>
                 <w:szCs w:val="18"/>
               </w:rPr>
-              <w:t>{{SIGNATURE_TITLE</w:t>
-            </w:r>
-            <w:r>
-              <w:rPr>
-                <w:rFonts w:ascii="Times New Roman" w:hAnsi="Times New Roman" w:cs="Times New Roman"/>
-                <w:color w:val="211E1F"/>
-                <w:sz w:val="18"/>
-                <w:szCs w:val="18"/>
-              </w:rPr>
-              <w:t>_2</w:t>
-            </w:r>
-            <w:r>
-              <w:rPr>
-                <w:rFonts w:ascii="Times New Roman" w:hAnsi="Times New Roman" w:cs="Times New Roman"/>
-                <w:color w:val="211E1F"/>
-                <w:sz w:val="18"/>
-                <w:szCs w:val="18"/>
-              </w:rPr>
-              <w:t>}}</w:t>
-            </w:r>
-          </w:p>
-          <w:p>
-            <w:pPr>
-              <w:pStyle w:val="BodyText"/>
-              <w:tabs>
-                <w:tab w:val="left" w:pos="5118"/>
-              </w:tabs>
-              <w:spacing w:before="12"/>
-              <w:rPr>
-                <w:rFonts w:ascii="Times New Roman" w:hAnsi="Times New Roman" w:cs="Times New Roman"/>
-                <w:noProof/>
-                <w:color w:val="211E1F"/>
-                <w:sz w:val="18"/>
-                <w:szCs w:val="18"/>
-              </w:rPr>
-            </w:pPr>
-            <w:r>
-              <w:rPr>
-                <w:rFonts w:ascii="Times New Roman" w:hAnsi="Times New Roman" w:cs="Times New Roman"/>
-                <w:noProof/>
-                <w:color w:val="211E1F"/>
-                <w:sz w:val="18"/>
-                <w:szCs w:val="18"/>
-              </w:rPr>
-              <w:t>{{VESTING}}</w:t>
+              <w:t>{{SIGNATURE_TITLE_2}}</w:t>
             </w:r>
           </w:p>
           <w:p>

</xml_diff>